<commit_message>
Events Sub-Domain Overview v1.1 -> v1.2: public discovery + CR-RESOURCES handoff
- New Section 4.11 Public Event Listing and Discovery: listedPublicly/publishedAt,
  the custom-web-app public events list (listed + Scheduled + not-yet-started,
  soonest-first, drop-off at start), registration routing, auto-unlist on
  Cancel/Postpone.
- Section 5: handoff to the new CR-RESOURCES sub-domain for recording migration
  (recordingUrl raw-source entry point; published copy is a separate Resource). v1.2 log row.
</commit_message>
<xml_diff>
--- a/PRDs/CR/EVENTS/CBM-SubDomain-Overview-Events.docx
+++ b/PRDs/CR/EVENTS/CBM-SubDomain-Overview-Events.docx
@@ -114,7 +114,7 @@
                 <w:sz w:val="20"/>
                 <w:szCs w:val="20"/>
               </w:rPr>
-              <w:t xml:space="preserve">1.1</w:t>
+              <w:t xml:space="preserve">1.2</w:t>
             </w:r>
           </w:p>
         </w:tc>
@@ -244,7 +244,7 @@
                 <w:sz w:val="20"/>
                 <w:szCs w:val="20"/>
               </w:rPr>
-              <w:t xml:space="preserve">05-29-26 14:00</w:t>
+              <w:t xml:space="preserve">05-29-26 16:30</w:t>
             </w:r>
           </w:p>
         </w:tc>
@@ -6861,6 +6861,37 @@
     </w:p>
     <w:p>
       <w:pPr>
+        <w:pStyle w:val="Heading2"/>
+      </w:pPr>
+      <w:r>
+        <w:rPr>
+          <w:rFonts w:ascii="Arial" w:cs="Arial" w:eastAsia="Arial" w:hAnsi="Arial"/>
+        </w:rPr>
+        <w:t xml:space="preserve">4.11 Public Event Listing and Discovery</w:t>
+      </w:r>
+    </w:p>
+    <w:p>
+      <w:r>
+        <w:rPr>
+          <w:rFonts w:ascii="Arial" w:cs="Arial" w:eastAsia="Arial" w:hAnsi="Arial"/>
+          <w:sz w:val="22"/>
+          <w:szCs w:val="22"/>
+        </w:rPr>
+        <w:t xml:space="preserve">Beyond per-event registration links, the Events sub-domain supports a public list of upcoming events that prospective attendees can browse. Two fields on the Event govern this: listedPublicly, a reversible publish flag, and publishedAt, the system-set first-publication time. Publishing to the list is a deliberate action separate from the Scheduled status — an event can be Scheduled without being listed, and it can be unlisted without changing status.</w:t>
+      </w:r>
+    </w:p>
+    <w:p>
+      <w:r>
+        <w:rPr>
+          <w:rFonts w:ascii="Arial" w:cs="Arial" w:eastAsia="Arial" w:hAnsi="Arial"/>
+          <w:sz w:val="22"/>
+          <w:szCs w:val="22"/>
+        </w:rPr>
+        <w:t xml:space="preserve">The public list is hosted in the custom web application. It shows only events that are listed, at Scheduled status, and not yet started, ordered soonest-first; an event drops off the list at its start time. Selecting an event leads to the same public registration form, so a registration originating from the list follows the identical Contact match-or-create and Account precedence handling. The system clears listedPublicly automatically when an event is Cancelled or Postponed.</w:t>
+      </w:r>
+    </w:p>
+    <w:p>
+      <w:pPr>
         <w:pStyle w:val="Heading1"/>
         <w:spacing w:after="120" w:before="360"/>
       </w:pPr>
@@ -7021,6 +7052,28 @@
           <w:szCs w:val="22"/>
         </w:rPr>
         <w:t xml:space="preserve"> CR-EVENTS attribution data (Workshop or Event source value, event name in sourceAttributionDetails) and per-event conversion metrics feed the cross-sub-domain channel effectiveness comparison described in CR Domain Overview Section 3.9. The comparison reports are defined and governed by CR Domain Reconciliation (Phase 5), not by CR-EVENTS.</w:t>
+      </w:r>
+    </w:p>
+    <w:p>
+      <w:r>
+        <w:rPr>
+          <w:rFonts w:ascii="Arial" w:cs="Arial" w:eastAsia="Arial" w:hAnsi="Arial"/>
+          <w:b/>
+          <w:bCs/>
+          <w:sz w:val="22"/>
+          <w:szCs w:val="22"/>
+        </w:rPr>
+        <w:t xml:space="preserve">Handoff to CR-RESOURCES (Resource Library)</w:t>
+      </w:r>
+    </w:p>
+    <w:p>
+      <w:r>
+        <w:rPr>
+          <w:rFonts w:ascii="Arial" w:cs="Arial" w:eastAsia="Arial" w:hAnsi="Arial"/>
+          <w:sz w:val="22"/>
+          <w:szCs w:val="22"/>
+        </w:rPr>
+        <w:t xml:space="preserve">After an event is Completed, its recording can be migrated into a published resource on the public Resources page, which the CR-RESOURCES sub-domain owns. The event’s recordingUrl is the back-office entry point to the raw recording; the Content and Event Administrator retrieves it, edits and re-hosts the finished version, and creates a Resource that links back to the event. The raw recordingUrl is never published. This recording-migration step is defined as an optional final step in CR-EVENTS-MANAGE and continues into CR-RESOURCES-MANAGE.</w:t>
       </w:r>
     </w:p>
     <w:p>
@@ -11976,6 +12029,98 @@
                 <w:szCs w:val="20"/>
               </w:rPr>
               <w:t xml:space="preserve">Summary of Changes</w:t>
+            </w:r>
+          </w:p>
+        </w:tc>
+      </w:tr>
+      <w:tr>
+        <w:tc>
+          <w:tcPr>
+            <w:tcW w:type="dxa" w:w="1300"/>
+            <w:tcBorders>
+              <w:top w:val="single" w:color="AAAAAA" w:sz="1"/>
+              <w:left w:val="single" w:color="AAAAAA" w:sz="1"/>
+              <w:bottom w:val="single" w:color="AAAAAA" w:sz="1"/>
+              <w:right w:val="single" w:color="AAAAAA" w:sz="1"/>
+            </w:tcBorders>
+            <w:shd w:fill="F2F7FB" w:val="clear"/>
+            <w:tcMar>
+              <w:top w:type="dxa" w:w="60"/>
+              <w:left w:type="dxa" w:w="100"/>
+              <w:bottom w:type="dxa" w:w="60"/>
+              <w:right w:type="dxa" w:w="100"/>
+            </w:tcMar>
+          </w:tcPr>
+          <w:p>
+            <w:r>
+              <w:rPr>
+                <w:rFonts w:ascii="Arial" w:cs="Arial" w:eastAsia="Arial" w:hAnsi="Arial"/>
+                <w:b/>
+                <w:bCs/>
+                <w:sz w:val="20"/>
+                <w:szCs w:val="20"/>
+              </w:rPr>
+              <w:t xml:space="preserve">1.2</w:t>
+            </w:r>
+          </w:p>
+        </w:tc>
+        <w:tc>
+          <w:tcPr>
+            <w:tcW w:type="dxa" w:w="1900"/>
+            <w:tcBorders>
+              <w:top w:val="single" w:color="AAAAAA" w:sz="1"/>
+              <w:left w:val="single" w:color="AAAAAA" w:sz="1"/>
+              <w:bottom w:val="single" w:color="AAAAAA" w:sz="1"/>
+              <w:right w:val="single" w:color="AAAAAA" w:sz="1"/>
+            </w:tcBorders>
+            <w:shd w:fill="F2F7FB" w:val="clear"/>
+            <w:tcMar>
+              <w:top w:type="dxa" w:w="60"/>
+              <w:left w:type="dxa" w:w="100"/>
+              <w:bottom w:type="dxa" w:w="60"/>
+              <w:right w:type="dxa" w:w="100"/>
+            </w:tcMar>
+          </w:tcPr>
+          <w:p>
+            <w:r>
+              <w:rPr>
+                <w:rFonts w:ascii="Arial" w:cs="Arial" w:eastAsia="Arial" w:hAnsi="Arial"/>
+                <w:b w:val="false"/>
+                <w:bCs w:val="false"/>
+                <w:sz w:val="20"/>
+                <w:szCs w:val="20"/>
+              </w:rPr>
+              <w:t xml:space="preserve">05-29-26 16:30</w:t>
+            </w:r>
+          </w:p>
+        </w:tc>
+        <w:tc>
+          <w:tcPr>
+            <w:tcW w:type="dxa" w:w="6160"/>
+            <w:tcBorders>
+              <w:top w:val="single" w:color="AAAAAA" w:sz="1"/>
+              <w:left w:val="single" w:color="AAAAAA" w:sz="1"/>
+              <w:bottom w:val="single" w:color="AAAAAA" w:sz="1"/>
+              <w:right w:val="single" w:color="AAAAAA" w:sz="1"/>
+            </w:tcBorders>
+            <w:shd w:fill="F2F7FB" w:val="clear"/>
+            <w:tcMar>
+              <w:top w:type="dxa" w:w="60"/>
+              <w:left w:type="dxa" w:w="100"/>
+              <w:bottom w:type="dxa" w:w="60"/>
+              <w:right w:type="dxa" w:w="100"/>
+            </w:tcMar>
+          </w:tcPr>
+          <w:p>
+            <w:r>
+              <w:rPr>
+                <w:rFonts w:ascii="Arial" w:cs="Arial" w:eastAsia="Arial" w:hAnsi="Arial"/>
+                <w:b w:val="false"/>
+                <w:bCs w:val="false"/>
+                <w:sz w:val="20"/>
+                <w:szCs w:val="20"/>
+              </w:rPr>
+              <w:t xml:space="preserve">Added Section 4.11 Public Event Listing and Discovery (listedPublicly / publishedAt, the custom-web-app public events list, soonest-first with drop-off at start, auto-unlist on Cancel/Postpone) and a Section 5 handoff to the new CR-RESOURCES sub-domain for recording migration.</w:t>
             </w:r>
           </w:p>
         </w:tc>

</xml_diff>